<commit_message>
Updated Readme for all
</commit_message>
<xml_diff>
--- a/Audiobased-Health_Monitoring_LLM_RAG/Health_Monitoring_AudioBased.docx
+++ b/Audiobased-Health_Monitoring_LLM_RAG/Health_Monitoring_AudioBased.docx
@@ -12,24 +12,6 @@
     </w:p>
     <w:p>
       <w:pPr>
-        <w:pStyle w:val="NormalWeb"/>
-      </w:pPr>
-      <w:r>
-        <w:rPr>
-          <w:rFonts w:ascii="Segoe UI Emoji" w:hAnsi="Segoe UI Emoji" w:cs="Segoe UI Emoji"/>
-        </w:rPr>
-        <w:t>👇</w:t>
-      </w:r>
-    </w:p>
-    <w:p>
-      <w:r>
-        <w:pict w14:anchorId="54D7015F">
-          <v:rect id="_x0000_i1025" style="width:0;height:1.5pt" o:hralign="center" o:hrstd="t" o:hr="t" fillcolor="#a0a0a0" stroked="f"/>
-        </w:pict>
-      </w:r>
-    </w:p>
-    <w:p>
-      <w:pPr>
         <w:pStyle w:val="Heading1"/>
       </w:pPr>
       <w:r>
@@ -48,9 +30,9 @@
           <w:noProof/>
         </w:rPr>
         <w:drawing>
-          <wp:inline distT="0" distB="0" distL="0" distR="0" wp14:anchorId="575C82A3" wp14:editId="4CA39045">
-            <wp:extent cx="5486400" cy="3657600"/>
-            <wp:effectExtent l="0" t="0" r="0" b="0"/>
+          <wp:inline distT="0" distB="0" distL="0" distR="0" wp14:anchorId="575C82A3" wp14:editId="0DCE7561">
+            <wp:extent cx="5486400" cy="3190875"/>
+            <wp:effectExtent l="0" t="0" r="0" b="9525"/>
             <wp:docPr id="3" name="Picture 3"/>
             <wp:cNvGraphicFramePr>
               <a:graphicFrameLocks xmlns:a="http://schemas.openxmlformats.org/drawingml/2006/main" noChangeAspect="1"/>
@@ -80,7 +62,7 @@
                   <pic:spPr bwMode="auto">
                     <a:xfrm>
                       <a:off x="0" y="0"/>
-                      <a:ext cx="5486400" cy="3657600"/>
+                      <a:ext cx="5486400" cy="3190875"/>
                     </a:xfrm>
                     <a:prstGeom prst="rect">
                       <a:avLst/>
@@ -161,7 +143,7 @@
           </mc:Choice>
           <mc:Fallback>
             <w:pict>
-              <v:rect w14:anchorId="4B3A6AB7" id="Rectangle 2" o:spid="_x0000_s1026" style="width:24pt;height:24pt;visibility:visible;mso-wrap-style:square;mso-left-percent:-10001;mso-top-percent:-10001;mso-position-horizontal:absolute;mso-position-horizontal-relative:char;mso-position-vertical:absolute;mso-position-vertical-relative:line;mso-left-percent:-10001;mso-top-percent:-10001;v-text-anchor:top" o:gfxdata="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" filled="f" stroked="f">
+              <v:rect w14:anchorId="55794B27" id="Rectangle 2" o:spid="_x0000_s1026" style="width:24pt;height:24pt;visibility:visible;mso-wrap-style:square;mso-left-percent:-10001;mso-top-percent:-10001;mso-position-horizontal:absolute;mso-position-horizontal-relative:char;mso-position-vertical:absolute;mso-position-vertical-relative:line;mso-left-percent:-10001;mso-top-percent:-10001;v-text-anchor:top" o:gfxdata="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" filled="f" stroked="f">
                 <o:lock v:ext="edit" aspectratio="t"/>
                 <w10:anchorlock/>
               </v:rect>
@@ -227,21 +209,6 @@
       </w:r>
     </w:p>
     <w:p>
-      <w:r>
-        <w:rPr>
-          <w:rStyle w:val="text-xs"/>
-        </w:rPr>
-        <w:t>4</w:t>
-      </w:r>
-    </w:p>
-    <w:p>
-      <w:r>
-        <w:pict w14:anchorId="3117B5B9">
-          <v:rect id="_x0000_i1029" style="width:0;height:1.5pt" o:hralign="center" o:hrstd="t" o:hr="t" fillcolor="#a0a0a0" stroked="f"/>
-        </w:pict>
-      </w:r>
-    </w:p>
-    <w:p>
       <w:pPr>
         <w:pStyle w:val="Heading1"/>
       </w:pPr>
@@ -379,203 +346,6 @@
       <w:proofErr w:type="spellEnd"/>
       <w:r>
         <w:t xml:space="preserve"> UI</w:t>
-      </w:r>
-    </w:p>
-    <w:p>
-      <w:r>
-        <w:pict w14:anchorId="75A35072">
-          <v:rect id="_x0000_i1030" style="width:0;height:1.5pt" o:hralign="center" o:hrstd="t" o:hr="t" fillcolor="#a0a0a0" stroked="f"/>
-        </w:pict>
-      </w:r>
-    </w:p>
-    <w:p>
-      <w:pPr>
-        <w:pStyle w:val="Heading1"/>
-      </w:pPr>
-      <w:r>
-        <w:rPr>
-          <w:rFonts w:ascii="Segoe UI Emoji" w:hAnsi="Segoe UI Emoji" w:cs="Segoe UI Emoji"/>
-        </w:rPr>
-        <w:t>🔁</w:t>
-      </w:r>
-      <w:r>
-        <w:t xml:space="preserve"> Detailed Flow (Step-by-Step)</w:t>
-      </w:r>
-    </w:p>
-    <w:p>
-      <w:pPr>
-        <w:pStyle w:val="HTMLPreformatted"/>
-      </w:pPr>
-      <w:r>
-        <w:t>[User]</w:t>
-      </w:r>
-      <w:r>
-        <w:br/>
-        <w:t xml:space="preserve">   ↓</w:t>
-      </w:r>
-      <w:r>
-        <w:br/>
-      </w:r>
-      <w:r>
-        <w:rPr>
-          <w:rFonts w:ascii="Segoe UI Emoji" w:hAnsi="Segoe UI Emoji" w:cs="Segoe UI Emoji"/>
-        </w:rPr>
-        <w:t>🎤</w:t>
-      </w:r>
-      <w:r>
-        <w:t xml:space="preserve"> Speak into microphone</w:t>
-      </w:r>
-      <w:r>
-        <w:br/>
-        <w:t xml:space="preserve">   ↓</w:t>
-      </w:r>
-      <w:r>
-        <w:br/>
-        <w:t>[</w:t>
-      </w:r>
-      <w:proofErr w:type="spellStart"/>
-      <w:r>
-        <w:t>Streamlit</w:t>
-      </w:r>
-      <w:proofErr w:type="spellEnd"/>
-      <w:r>
-        <w:t xml:space="preserve"> UI]</w:t>
-      </w:r>
-      <w:r>
-        <w:br/>
-        <w:t xml:space="preserve">   ↓</w:t>
-      </w:r>
-      <w:r>
-        <w:br/>
-      </w:r>
-      <w:r>
-        <w:rPr>
-          <w:rFonts w:ascii="Segoe UI Emoji" w:hAnsi="Segoe UI Emoji" w:cs="Segoe UI Emoji"/>
-        </w:rPr>
-        <w:lastRenderedPageBreak/>
-        <w:t>🎧</w:t>
-      </w:r>
-      <w:r>
-        <w:t xml:space="preserve"> Capture audio (bytes)</w:t>
-      </w:r>
-      <w:r>
-        <w:br/>
-        <w:t xml:space="preserve">   ↓</w:t>
-      </w:r>
-      <w:r>
-        <w:br/>
-        <w:t>[Whisper Model]</w:t>
-      </w:r>
-      <w:r>
-        <w:br/>
-        <w:t xml:space="preserve">   ↓</w:t>
-      </w:r>
-      <w:r>
-        <w:br/>
-      </w:r>
-      <w:r>
-        <w:rPr>
-          <w:rFonts w:ascii="Segoe UI Emoji" w:hAnsi="Segoe UI Emoji" w:cs="Segoe UI Emoji"/>
-        </w:rPr>
-        <w:t>🔤</w:t>
-      </w:r>
-      <w:r>
-        <w:t xml:space="preserve"> Convert audio → text</w:t>
-      </w:r>
-      <w:r>
-        <w:br/>
-        <w:t xml:space="preserve">   ↓</w:t>
-      </w:r>
-      <w:r>
-        <w:br/>
-        <w:t>[Text Processing]</w:t>
-      </w:r>
-      <w:r>
-        <w:br/>
-        <w:t xml:space="preserve">   ↓</w:t>
-      </w:r>
-      <w:r>
-        <w:br/>
-      </w:r>
-      <w:r>
-        <w:rPr>
-          <w:rFonts w:ascii="Segoe UI Emoji" w:hAnsi="Segoe UI Emoji" w:cs="Segoe UI Emoji"/>
-        </w:rPr>
-        <w:t>🤖</w:t>
-      </w:r>
-      <w:r>
-        <w:t xml:space="preserve"> Send to OpenAI API</w:t>
-      </w:r>
-      <w:r>
-        <w:br/>
-        <w:t xml:space="preserve">   ↓</w:t>
-      </w:r>
-      <w:r>
-        <w:br/>
-        <w:t>[LLM Reasoning]</w:t>
-      </w:r>
-      <w:r>
-        <w:br/>
-        <w:t xml:space="preserve">   ↓</w:t>
-      </w:r>
-      <w:r>
-        <w:br/>
-      </w:r>
-      <w:r>
-        <w:rPr>
-          <w:rFonts w:ascii="Segoe UI Emoji" w:hAnsi="Segoe UI Emoji" w:cs="Segoe UI Emoji"/>
-        </w:rPr>
-        <w:t>📄</w:t>
-      </w:r>
-      <w:r>
-        <w:t xml:space="preserve"> Generate response</w:t>
-      </w:r>
-      <w:r>
-        <w:br/>
-        <w:t xml:space="preserve">   ↓</w:t>
-      </w:r>
-      <w:r>
-        <w:br/>
-        <w:t>[</w:t>
-      </w:r>
-      <w:proofErr w:type="spellStart"/>
-      <w:r>
-        <w:t>Streamlit</w:t>
-      </w:r>
-      <w:proofErr w:type="spellEnd"/>
-      <w:r>
-        <w:t xml:space="preserve"> UI]</w:t>
-      </w:r>
-      <w:r>
-        <w:br/>
-        <w:t xml:space="preserve">   ↓</w:t>
-      </w:r>
-      <w:r>
-        <w:br/>
-      </w:r>
-      <w:r>
-        <w:rPr>
-          <w:rFonts w:ascii="Segoe UI Emoji" w:hAnsi="Segoe UI Emoji" w:cs="Segoe UI Emoji"/>
-        </w:rPr>
-        <w:t>🖥️</w:t>
-      </w:r>
-      <w:r>
-        <w:t xml:space="preserve"> Show:</w:t>
-      </w:r>
-      <w:r>
-        <w:br/>
-        <w:t xml:space="preserve">   - Transcription</w:t>
-      </w:r>
-      <w:r>
-        <w:br/>
-        <w:t xml:space="preserve">   - Answer</w:t>
-      </w:r>
-    </w:p>
-    <w:p>
-      <w:r>
-        <w:pict w14:anchorId="1552283E">
-          <v:rect id="_x0000_i1031" style="width:0;height:1.5pt" o:hralign="center" o:hrstd="t" o:hr="t" fillcolor="#a0a0a0" stroked="f"/>
-        </w:pict>
       </w:r>
     </w:p>
     <w:p/>
@@ -584,80 +354,184 @@
         <w:pStyle w:val="Heading1"/>
       </w:pPr>
       <w:r>
-        <w:t>3. Required Installations</w:t>
+        <w:rPr>
+          <w:rFonts w:ascii="Segoe UI Emoji" w:hAnsi="Segoe UI Emoji" w:cs="Segoe UI Emoji"/>
+        </w:rPr>
+        <w:t>🔁</w:t>
+      </w:r>
+      <w:r>
+        <w:t xml:space="preserve"> Detailed Flow (Step-by-Step)</w:t>
       </w:r>
     </w:p>
     <w:p>
+      <w:pPr>
+        <w:pStyle w:val="HTMLPreformatted"/>
+      </w:pPr>
+      <w:r>
+        <w:t>[User]</w:t>
+      </w:r>
       <w:r>
         <w:br/>
-        <w:t xml:space="preserve">pip install </w:t>
+        <w:t xml:space="preserve">   ↓</w:t>
+      </w:r>
+      <w:r>
+        <w:br/>
+      </w:r>
+      <w:r>
+        <w:rPr>
+          <w:rFonts w:ascii="Segoe UI Emoji" w:hAnsi="Segoe UI Emoji" w:cs="Segoe UI Emoji"/>
+        </w:rPr>
+        <w:t>🎤</w:t>
+      </w:r>
+      <w:r>
+        <w:t xml:space="preserve"> Speak into microphone</w:t>
+      </w:r>
+      <w:r>
+        <w:br/>
+        <w:t xml:space="preserve">   ↓</w:t>
+      </w:r>
+      <w:r>
+        <w:br/>
+        <w:t>[</w:t>
       </w:r>
       <w:proofErr w:type="spellStart"/>
       <w:r>
-        <w:t>streamlit</w:t>
+        <w:t>Streamlit</w:t>
       </w:r>
       <w:proofErr w:type="spellEnd"/>
       <w:r>
-        <w:t xml:space="preserve"> </w:t>
+        <w:t xml:space="preserve"> UI]</w:t>
+      </w:r>
+      <w:r>
+        <w:br/>
+        <w:t xml:space="preserve">   ↓</w:t>
+      </w:r>
+      <w:r>
+        <w:br/>
+      </w:r>
+      <w:r>
+        <w:rPr>
+          <w:rFonts w:ascii="Segoe UI Emoji" w:hAnsi="Segoe UI Emoji" w:cs="Segoe UI Emoji"/>
+        </w:rPr>
+        <w:t>🎧</w:t>
+      </w:r>
+      <w:r>
+        <w:t xml:space="preserve"> Capture audio (bytes)</w:t>
+      </w:r>
+      <w:r>
+        <w:br/>
+        <w:t xml:space="preserve">   ↓</w:t>
+      </w:r>
+      <w:r>
+        <w:br/>
+        <w:t>[Whisper Model]</w:t>
+      </w:r>
+      <w:r>
+        <w:br/>
+        <w:t xml:space="preserve">   ↓</w:t>
+      </w:r>
+      <w:r>
+        <w:br/>
+      </w:r>
+      <w:r>
+        <w:rPr>
+          <w:rFonts w:ascii="Segoe UI Emoji" w:hAnsi="Segoe UI Emoji" w:cs="Segoe UI Emoji"/>
+        </w:rPr>
+        <w:t>🔤</w:t>
+      </w:r>
+      <w:r>
+        <w:t xml:space="preserve"> Convert audio → text</w:t>
+      </w:r>
+      <w:r>
+        <w:br/>
+      </w:r>
+      <w:r>
+        <w:lastRenderedPageBreak/>
+        <w:t xml:space="preserve">   ↓</w:t>
+      </w:r>
+      <w:r>
+        <w:br/>
+        <w:t>[Text Processing]</w:t>
+      </w:r>
+      <w:r>
+        <w:br/>
+        <w:t xml:space="preserve">   ↓</w:t>
+      </w:r>
+      <w:r>
+        <w:br/>
+      </w:r>
+      <w:r>
+        <w:rPr>
+          <w:rFonts w:ascii="Segoe UI Emoji" w:hAnsi="Segoe UI Emoji" w:cs="Segoe UI Emoji"/>
+        </w:rPr>
+        <w:t>🤖</w:t>
+      </w:r>
+      <w:r>
+        <w:t xml:space="preserve"> Send to OpenAI API</w:t>
+      </w:r>
+      <w:r>
+        <w:br/>
+        <w:t xml:space="preserve">   ↓</w:t>
+      </w:r>
+      <w:r>
+        <w:br/>
+        <w:t>[LLM Reasoning]</w:t>
+      </w:r>
+      <w:r>
+        <w:br/>
+        <w:t xml:space="preserve">   ↓</w:t>
+      </w:r>
+      <w:r>
+        <w:br/>
+      </w:r>
+      <w:r>
+        <w:rPr>
+          <w:rFonts w:ascii="Segoe UI Emoji" w:hAnsi="Segoe UI Emoji" w:cs="Segoe UI Emoji"/>
+        </w:rPr>
+        <w:t>📄</w:t>
+      </w:r>
+      <w:r>
+        <w:t xml:space="preserve"> Generate response</w:t>
+      </w:r>
+      <w:r>
+        <w:br/>
+        <w:t xml:space="preserve">   ↓</w:t>
+      </w:r>
+      <w:r>
+        <w:br/>
+        <w:t>[</w:t>
       </w:r>
       <w:proofErr w:type="spellStart"/>
       <w:r>
-        <w:t>streamlit-webrtc</w:t>
+        <w:t>Streamlit</w:t>
       </w:r>
       <w:proofErr w:type="spellEnd"/>
       <w:r>
-        <w:t xml:space="preserve"> av </w:t>
-      </w:r>
-      <w:proofErr w:type="spellStart"/>
-      <w:r>
-        <w:t>openai</w:t>
-      </w:r>
-      <w:proofErr w:type="spellEnd"/>
-      <w:r>
-        <w:t xml:space="preserve">-whisper </w:t>
-      </w:r>
-      <w:proofErr w:type="spellStart"/>
-      <w:r>
-        <w:t>faiss-cpu</w:t>
-      </w:r>
-      <w:proofErr w:type="spellEnd"/>
-      <w:r>
-        <w:t xml:space="preserve"> </w:t>
+        <w:t xml:space="preserve"> UI]</w:t>
       </w:r>
       <w:r>
         <w:br/>
-      </w:r>
-      <w:proofErr w:type="spellStart"/>
-      <w:r>
-        <w:t>langchain</w:t>
-      </w:r>
-      <w:proofErr w:type="spellEnd"/>
-      <w:r>
-        <w:t xml:space="preserve"> </w:t>
-      </w:r>
-      <w:proofErr w:type="spellStart"/>
-      <w:r>
-        <w:t>langchain</w:t>
-      </w:r>
-      <w:proofErr w:type="spellEnd"/>
-      <w:r>
-        <w:t xml:space="preserve">-community </w:t>
-      </w:r>
-      <w:proofErr w:type="spellStart"/>
-      <w:r>
-        <w:t>langchain</w:t>
-      </w:r>
-      <w:proofErr w:type="spellEnd"/>
-      <w:r>
-        <w:t xml:space="preserve">-text-splitters sentence-transformers </w:t>
-      </w:r>
-      <w:proofErr w:type="spellStart"/>
-      <w:r>
-        <w:t>soundfile</w:t>
-      </w:r>
-      <w:proofErr w:type="spellEnd"/>
+        <w:t xml:space="preserve">   ↓</w:t>
+      </w:r>
       <w:r>
         <w:br/>
+      </w:r>
+      <w:r>
+        <w:rPr>
+          <w:rFonts w:ascii="Segoe UI Emoji" w:hAnsi="Segoe UI Emoji" w:cs="Segoe UI Emoji"/>
+        </w:rPr>
+        <w:t>🖥️</w:t>
+      </w:r>
+      <w:r>
+        <w:t xml:space="preserve"> Show:</w:t>
+      </w:r>
+      <w:r>
+        <w:br/>
+        <w:t xml:space="preserve">   - Transcription</w:t>
+      </w:r>
+      <w:r>
+        <w:br/>
+        <w:t xml:space="preserve">   - Answer</w:t>
       </w:r>
     </w:p>
     <w:p>
@@ -665,25 +539,81 @@
         <w:pStyle w:val="Heading1"/>
       </w:pPr>
       <w:r>
-        <w:t>4. Microsoft Visual C++ (MANDATORY)</w:t>
+        <w:t>1</w:t>
+      </w:r>
+      <w:r>
+        <w:t>. Required Installations</w:t>
       </w:r>
     </w:p>
     <w:p>
       <w:r>
         <w:br/>
-        <w:t>Download (x64):</w:t>
+        <w:t xml:space="preserve">pip install </w:t>
+      </w:r>
+      <w:proofErr w:type="spellStart"/>
+      <w:r>
+        <w:t>streamlit</w:t>
+      </w:r>
+      <w:proofErr w:type="spellEnd"/>
+      <w:r>
+        <w:t xml:space="preserve"> </w:t>
+      </w:r>
+      <w:proofErr w:type="spellStart"/>
+      <w:r>
+        <w:t>streamlit-webrtc</w:t>
+      </w:r>
+      <w:proofErr w:type="spellEnd"/>
+      <w:r>
+        <w:t xml:space="preserve"> av </w:t>
+      </w:r>
+      <w:proofErr w:type="spellStart"/>
+      <w:r>
+        <w:t>openai</w:t>
+      </w:r>
+      <w:proofErr w:type="spellEnd"/>
+      <w:r>
+        <w:t xml:space="preserve">-whisper </w:t>
+      </w:r>
+      <w:proofErr w:type="spellStart"/>
+      <w:r>
+        <w:t>faiss-cpu</w:t>
+      </w:r>
+      <w:proofErr w:type="spellEnd"/>
+      <w:r>
+        <w:t xml:space="preserve"> </w:t>
       </w:r>
       <w:r>
         <w:br/>
-        <w:t>https://aka.ms/vs/17/release/vc_redist.x64.exe</w:t>
-      </w:r>
-      <w:r>
-        <w:br/>
-      </w:r>
-      <w:r>
-        <w:br/>
-        <w:t>Install → Restart system</w:t>
-      </w:r>
+      </w:r>
+      <w:proofErr w:type="spellStart"/>
+      <w:r>
+        <w:t>langchain</w:t>
+      </w:r>
+      <w:proofErr w:type="spellEnd"/>
+      <w:r>
+        <w:t xml:space="preserve"> </w:t>
+      </w:r>
+      <w:proofErr w:type="spellStart"/>
+      <w:r>
+        <w:t>langchain</w:t>
+      </w:r>
+      <w:proofErr w:type="spellEnd"/>
+      <w:r>
+        <w:t xml:space="preserve">-community </w:t>
+      </w:r>
+      <w:proofErr w:type="spellStart"/>
+      <w:r>
+        <w:t>langchain</w:t>
+      </w:r>
+      <w:proofErr w:type="spellEnd"/>
+      <w:r>
+        <w:t xml:space="preserve">-text-splitters sentence-transformers </w:t>
+      </w:r>
+      <w:proofErr w:type="spellStart"/>
+      <w:r>
+        <w:t>soundfile</w:t>
+      </w:r>
+      <w:proofErr w:type="spellEnd"/>
       <w:r>
         <w:br/>
       </w:r>
@@ -693,61 +623,27 @@
         <w:pStyle w:val="Heading1"/>
       </w:pPr>
       <w:r>
-        <w:t>5. Azure Deployment Steps</w:t>
-      </w:r>
-      <w:r>
-        <w:t xml:space="preserve"> (Optional if you want to use that way)</w:t>
+        <w:t>2</w:t>
+      </w:r>
+      <w:r>
+        <w:t>. Microsoft Visual C++ (MANDATORY)</w:t>
       </w:r>
     </w:p>
     <w:p>
       <w:r>
         <w:br/>
-        <w:t>1. Create Azure App Service</w:t>
+        <w:t>Download (x64):</w:t>
       </w:r>
       <w:r>
         <w:br/>
-        <w:t>2. Enable Python runtime</w:t>
+        <w:t>https://aka.ms/vs/17/release/vc_redist.x64.exe</w:t>
       </w:r>
       <w:r>
         <w:br/>
-        <w:t>3. Upload project (Git or ZIP)</w:t>
       </w:r>
       <w:r>
         <w:br/>
-        <w:t>4. Set environment variable:</w:t>
-      </w:r>
-      <w:r>
-        <w:br/>
-        <w:t xml:space="preserve">   OPENAI_API_KEY</w:t>
-      </w:r>
-      <w:r>
-        <w:br/>
-      </w:r>
-      <w:r>
-        <w:lastRenderedPageBreak/>
-        <w:t>5. Run:</w:t>
-      </w:r>
-      <w:r>
-        <w:br/>
-        <w:t xml:space="preserve">   </w:t>
-      </w:r>
-      <w:proofErr w:type="spellStart"/>
-      <w:r>
-        <w:t>streamlit</w:t>
-      </w:r>
-      <w:proofErr w:type="spellEnd"/>
-      <w:r>
-        <w:t xml:space="preserve"> run health_monitor.py --</w:t>
-      </w:r>
-      <w:proofErr w:type="spellStart"/>
-      <w:proofErr w:type="gramStart"/>
-      <w:r>
-        <w:t>server.port</w:t>
-      </w:r>
-      <w:proofErr w:type="spellEnd"/>
-      <w:proofErr w:type="gramEnd"/>
-      <w:r>
-        <w:t xml:space="preserve"> 8000</w:t>
+        <w:t>Install → Restart system</w:t>
       </w:r>
       <w:r>
         <w:br/>
@@ -758,7 +654,76 @@
         <w:pStyle w:val="Heading1"/>
       </w:pPr>
       <w:r>
-        <w:t xml:space="preserve">6. </w:t>
+        <w:t>3</w:t>
+      </w:r>
+      <w:r>
+        <w:t>. Azure Deployment Steps</w:t>
+      </w:r>
+      <w:r>
+        <w:t xml:space="preserve"> (Optional if you want to use that way)</w:t>
+      </w:r>
+    </w:p>
+    <w:p>
+      <w:r>
+        <w:br/>
+        <w:t>1. Create Azure App Service</w:t>
+      </w:r>
+      <w:r>
+        <w:br/>
+        <w:t>2. Enable Python runtime</w:t>
+      </w:r>
+      <w:r>
+        <w:br/>
+        <w:t>3. Upload project (Git or ZIP)</w:t>
+      </w:r>
+      <w:r>
+        <w:br/>
+        <w:t>4. Set environment variable:</w:t>
+      </w:r>
+      <w:r>
+        <w:br/>
+        <w:t xml:space="preserve">   OPENAI_API_KEY</w:t>
+      </w:r>
+      <w:r>
+        <w:br/>
+        <w:t>5. Run:</w:t>
+      </w:r>
+      <w:r>
+        <w:br/>
+        <w:t xml:space="preserve">   </w:t>
+      </w:r>
+      <w:proofErr w:type="spellStart"/>
+      <w:r>
+        <w:t>streamlit</w:t>
+      </w:r>
+      <w:proofErr w:type="spellEnd"/>
+      <w:r>
+        <w:t xml:space="preserve"> run health_monitor.py --</w:t>
+      </w:r>
+      <w:proofErr w:type="spellStart"/>
+      <w:proofErr w:type="gramStart"/>
+      <w:r>
+        <w:t>server.port</w:t>
+      </w:r>
+      <w:proofErr w:type="spellEnd"/>
+      <w:proofErr w:type="gramEnd"/>
+      <w:r>
+        <w:t xml:space="preserve"> 8000</w:t>
+      </w:r>
+      <w:r>
+        <w:br/>
+      </w:r>
+    </w:p>
+    <w:p>
+      <w:pPr>
+        <w:pStyle w:val="Heading1"/>
+      </w:pPr>
+      <w:r>
+        <w:lastRenderedPageBreak/>
+        <w:t>4</w:t>
+      </w:r>
+      <w:r>
+        <w:t xml:space="preserve">. </w:t>
       </w:r>
       <w:proofErr w:type="spellStart"/>
       <w:r>
@@ -12402,7 +12367,6 @@
     <w:name w:val="Normal (Web)"/>
     <w:basedOn w:val="Normal"/>
     <w:uiPriority w:val="99"/>
-    <w:semiHidden/>
     <w:unhideWhenUsed/>
     <w:rsid w:val="00E5159A"/>
     <w:pPr>

</xml_diff>